<commit_message>
Document escape mechanics and refresh illustrated showcase
Expand the illustrated LaTeX report to 39 pages with separate contents and chapter starts. Update object inventories, rendering mathematics, escape controls, study materials, ten-slide presentation and two-minute demo. Include validated captures, independent-control comparisons, all-shader escape replays and packaged-runtime evidence.
</commit_message>
<xml_diff>
--- a/docs/showcase/Demonstration-Study-Guide.docx
+++ b/docs/showcase/Demonstration-Study-Guide.docx
@@ -30,7 +30,7 @@
     </w:p>
     <w:p>
       <w:r>
-        <w:t>Run bin/Release/HauntedToyRoom.exe from the project folder. The arrival starts automatically. Use Y to reach the toy room quickly, Shift+N for a full replay, and G to hide the interface. Press H for help. Keep the report PDF, slide deck and Project-Demo.mp4 together for the showcase.</w:t>
+        <w:t>Run bin/Release/HauntedToyRoom.exe from the project folder. The arrival starts automatically. Use Y to reach the hallway puzzle quickly, Shift+N for a full replay, and G to hide the interface. Press H for help. Keep the report PDF, slide deck and Project-Demo.mp4 together for the showcase.</w:t>
       </w:r>
     </w:p>
     <w:p>
@@ -95,7 +95,7 @@
           </w:tcPr>
           <w:p>
             <w:r>
-              <w:t>Welcome home: Penny's route links the garden, doorway, stairs and toy room.</w:t>
+              <w:t>The haunted house: Penny enters at night through hinged doors and the connected staircase.</w:t>
             </w:r>
           </w:p>
         </w:tc>
@@ -117,7 +117,7 @@
           </w:tcPr>
           <w:p>
             <w:r>
-              <w:t>A furnished world: Five reusable primitives build the house, furniture and articulated toys.</w:t>
+              <w:t>A furnished world: Five indexed primitive families form furniture and articulated toys.</w:t>
             </w:r>
           </w:p>
         </w:tc>
@@ -129,7 +129,7 @@
           </w:tcPr>
           <w:p>
             <w:r>
-              <w:t>0:20–0:32</w:t>
+              <w:t>0:20–0:30</w:t>
             </w:r>
           </w:p>
         </w:tc>
@@ -139,7 +139,7 @@
           </w:tcPr>
           <w:p>
             <w:r>
-              <w:t>Hierarchy in motion: Jessie attaches to Bullseye's saddle; one parent transform moves both.</w:t>
+              <w:t>Inspect the three clues: Train 2, clock 5, blocks 7. The code opens the real toy-room doors.</w:t>
             </w:r>
           </w:p>
         </w:tc>
@@ -151,7 +151,7 @@
           </w:tcPr>
           <w:p>
             <w:r>
-              <w:t>0:32–0:44</w:t>
+              <w:t>0:30–0:42</w:t>
             </w:r>
           </w:p>
         </w:tc>
@@ -161,7 +161,7 @@
           </w:tcPr>
           <w:p>
             <w:r>
-              <w:t>Flight, laser and collision: Buzz aims at the obstacle. The nearest ray hit receives an impulse.</w:t>
+              <w:t>Rescue through hierarchy: Penny activates two switches. Jessie rides Bullseye and dismounts onto the high platform.</w:t>
             </w:r>
           </w:p>
         </w:tc>
@@ -173,7 +173,7 @@
           </w:tcPr>
           <w:p>
             <w:r>
-              <w:t>0:44–0:56</w:t>
+              <w:t>0:42–0:52</w:t>
             </w:r>
           </w:p>
         </w:tc>
@@ -183,7 +183,7 @@
           </w:tcPr>
           <w:p>
             <w:r>
-              <w:t>Rescue and return: The car follows waypoints. Wheel rotation uses distance divided by radius.</w:t>
+              <w:t>Buzz and the pursuit: The release removes a translucent barrier. The ghost follows Penny to the stairs.</w:t>
             </w:r>
           </w:p>
         </w:tc>
@@ -195,7 +195,7 @@
           </w:tcPr>
           <w:p>
             <w:r>
-              <w:t>0:56–1:06</w:t>
+              <w:t>0:52–1:02</w:t>
             </w:r>
           </w:p>
         </w:tc>
@@ -205,7 +205,7 @@
           </w:tcPr>
           <w:p>
             <w:r>
-              <w:t>Live character takeover: Woody follows your controls while Jessie and Buzz continue the mission; 0 releases him, N enters full manual.</w:t>
+              <w:t>Live character takeover: Woody follows your input while the others continue. Zero releases ownership; N enters full manual mode.</w:t>
             </w:r>
           </w:p>
         </w:tc>
@@ -217,7 +217,7 @@
           </w:tcPr>
           <w:p>
             <w:r>
-              <w:t>1:06–1:14</w:t>
+              <w:t>1:02–1:10</w:t>
             </w:r>
           </w:p>
         </w:tc>
@@ -227,7 +227,7 @@
           </w:tcPr>
           <w:p>
             <w:r>
-              <w:t>Directional, point and spot: Moonlight is directional. The lamp adds a point source and a soft cone.</w:t>
+              <w:t>Directional, point and spot: Moonlight is directional; the lamp adds a point source and soft spotlight.</w:t>
             </w:r>
           </w:p>
         </w:tc>
@@ -239,7 +239,7 @@
           </w:tcPr>
           <w:p>
             <w:r>
-              <w:t>1:14–1:20</w:t>
+              <w:t>1:10–1:16</w:t>
             </w:r>
           </w:p>
         </w:tc>
@@ -249,7 +249,7 @@
           </w:tcPr>
           <w:p>
             <w:r>
-              <w:t>Gouraud shading: Light is evaluated at vertices; the rasterizer interpolates the result.</w:t>
+              <w:t>Gouraud shading: Lighting is evaluated at vertices and interpolated across triangles.</w:t>
             </w:r>
           </w:p>
         </w:tc>
@@ -261,7 +261,7 @@
           </w:tcPr>
           <w:p>
             <w:r>
-              <w:t>1:20–1:26</w:t>
+              <w:t>1:16–1:22</w:t>
             </w:r>
           </w:p>
         </w:tc>
@@ -271,7 +271,7 @@
           </w:tcPr>
           <w:p>
             <w:r>
-              <w:t>Phong shading: Interpolated normals are normalized; the reflection-vector highlight is per pixel.</w:t>
+              <w:t>Phong shading: Interpolated normals are normalised before per-fragment illumination.</w:t>
             </w:r>
           </w:p>
         </w:tc>
@@ -283,7 +283,7 @@
           </w:tcPr>
           <w:p>
             <w:r>
-              <w:t>1:26–1:34</w:t>
+              <w:t>1:22–1:30</w:t>
             </w:r>
           </w:p>
         </w:tc>
@@ -293,7 +293,7 @@
           </w:tcPr>
           <w:p>
             <w:r>
-              <w:t>Procedural textures: UVs map grain, wallpaper, fabric and lunar craters onto shared geometry.</w:t>
+              <w:t>Texture coordinates: UVs map wood, wallpaper, fabric and lunar craters onto shared geometry.</w:t>
             </w:r>
           </w:p>
         </w:tc>
@@ -305,7 +305,7 @@
           </w:tcPr>
           <w:p>
             <w:r>
-              <w:t>1:34–1:46</w:t>
+              <w:t>1:30–1:40</w:t>
             </w:r>
           </w:p>
         </w:tc>
@@ -315,7 +315,7 @@
           </w:tcPr>
           <w:p>
             <w:r>
-              <w:t>Ray tracing: A BVH finds analytic hits; shadow rays and mirror bounces reveal the polished floor.</w:t>
+              <w:t>Analytic ray tracing: A BVH accelerates exact primitive hits, shadows, mirror paths and straight transparency.</w:t>
             </w:r>
           </w:p>
         </w:tc>
@@ -327,7 +327,7 @@
           </w:tcPr>
           <w:p>
             <w:r>
-              <w:t>1:46–1:52</w:t>
+              <w:t>1:40–1:52</w:t>
             </w:r>
           </w:p>
         </w:tc>
@@ -337,7 +337,7 @@
           </w:tcPr>
           <w:p>
             <w:r>
-              <w:t>A quiet morning: The lamp turns off, the toys return home and Penny falls asleep.</w:t>
+              <w:t>The entrance breaks: Buzz flies and aims. Only a nearest-hit laser impact releases six physical wood fragments.</w:t>
             </w:r>
           </w:p>
         </w:tc>
@@ -359,7 +359,7 @@
           </w:tcPr>
           <w:p>
             <w:r>
-              <w:t>Thank you: Adiba Tahsin | Roll 2107031 | CSE-4102</w:t>
+              <w:t>The toys are safe: Every character is physically outside. The cast idles in the garden. Adiba Tahsin / 2107031 / CSE-4102.</w:t>
             </w:r>
           </w:p>
         </w:tc>
@@ -375,17 +375,17 @@
     </w:p>
     <w:p>
       <w:r>
-        <w:t>1. Y skips arrival; 1 selects Woody for live takeover. Hold W, turn with A/D, stop with Space. Jessie and Buzz continue their routes. Press 0 to release Woody; press N for full manual mode. Explain separate input ownership and scene-clock progression.</w:t>
+        <w:t>1. Y skips arrival. Inspect all three hallway clues with Enter, then approach the keypad. Enter 257 and confirm with Enter. A wrong code clears the digits and keeps the door locked.</w:t>
       </w:r>
     </w:p>
     <w:p>
       <w:r>
-        <w:t>2. 2 selects Jessie. R is distance-gated at 2.2 units. Move her near Bullseye or use the reproducible mounted launch below, then R. Select either rider or horse and drive; R dismounts.</w:t>
+        <w:t>2. Penny activates the two red low switches with Enter. Select Jessie with 2, approach Bullseye and press R. Ride beneath the high platform, R dismounts onto it, and Enter activates the third switch.</w:t>
       </w:r>
     </w:p>
     <w:p>
       <w:r>
-        <w:t>3. 4 selects Buzz. Q/E moves vertically, L toggles the laser, Z/X aims, B rebuilds blocks. Explain the emitter hierarchy, nearest-hit test and impulse.</w:t>
+        <w:t>3. Ctrl+0 selects Penny. Activate the red release near the rear translucent barrier. Return through the hallway, descend the stairs and press Enter at the sealed front door. Explain Buzz flight, actual nearest-hit laser impact and the six physical fragments.</w:t>
       </w:r>
     </w:p>
     <w:p>
@@ -430,7 +430,7 @@
     </w:p>
     <w:p>
       <w:r>
-        <w:t>.\bin\Release\HauntedToyRoom.exe --no-intro --no-raytrace --shading 1 --select 3 --cam 0.4,1.5,0.5,0.4,1.15,-1.8</w:t>
+        <w:t>.\bin\Release\HauntedToyRoom.exe --no-intro --manual --no-raytrace --shading 1 --select 3 --cam 0,1.5,-4.5,0,1.15,-6.6</w:t>
       </w:r>
     </w:p>
     <w:p>
@@ -443,7 +443,7 @@
     </w:p>
     <w:p>
       <w:r>
-        <w:t>Selection during playback owns only one actor. StoryDirector skips writes to that actor and advances a separate virtual route cursor for scene gates. Other actors continue normal waypoint motion and animation. They ignore the owned actor as an obstacle, so parking across a path cannot stall their choreography; wall and furniture contacts remain active for your actor. Buzz takeover uses a three-second doorway gate without changing your laser or aim. A mounted pair is detached when selected for independent control; remounting intentionally drives the connected pair. 0 releases ownership; N retains the separate full manual mode. Penny is controllable after arrival by clicking her. The arrival camera remains cinematic until Y or arrival completion.</w:t>
+        <w:t>Selection during playback owns only one actor. StoryDirector skips writes to that actor and advances a separate virtual route cursor for scene gates. Other actors continue normal waypoint motion and animation. They ignore the owned actor as an obstacle, so parking across a path cannot stall their choreography; wall and furniture contacts remain active for your actor. The door always requires a real laser hit, including when Buzz is manually controlled. The ending requires every actual character outside. Releasing control rejoins a waypoint on the current floor without teleporting. A mounted pair is detached when selected for independent control; remounting intentionally drives the connected pair. 0 releases ownership; N retains the separate full manual mode. Penny is controllable after arrival by clicking her or using Ctrl+0. The arrival camera remains cinematic until Y or arrival completion.</w:t>
       </w:r>
     </w:p>
     <w:p>
@@ -452,6 +452,44 @@
       </w:pPr>
       <w:r>
         <w:t>Questions you should answer</w:t>
+      </w:r>
+    </w:p>
+    <w:p>
+      <w:pPr>
+        <w:pStyle w:val="Heading1"/>
+      </w:pPr>
+      <w:r>
+        <w:t>Escape implementation and objects</w:t>
+      </w:r>
+    </w:p>
+    <w:p>
+      <w:r>
+        <w:t>The keypad requires all three inspected clues and the code 257. A wrong code shows Incorrect Code and clears only the digits. Penny must approach both low switches. Jessie must have ridden Bullseye beneath the high switch, dismounted onto its platform and completed her transition before Enter activates it. The rear release belongs to Penny. At the ground-floor entrance, Enter starts Buzz's flight. The door breaks only after his nearest laser hit is the actual door for more than 0.65 seconds. Six preallocated boards receive impulses; the ghost pursues at 1.6 units per second. The ending requires the broken entrance and Penny plus all four rescued toys physically outside.</w:t>
+      </w:r>
+    </w:p>
+    <w:p>
+      <w:r>
+        <w:t>The wooden train uses box chassis and cab pieces, a horizontal cylindrical boiler, chimney and cylinder wheels. Two separate cars and a raised seven-segment 2 identify its clue. Seven coloured cubes form the block clue's 7. The hallway clock has a circular cylinder case and a thin cylinder face. The provided BMP uses planar cap UVs; a negative v repeat corrects printed orientation after rotation. A raised 5 below the face keeps the clue readable. The combination keypad has a solid wood housing, steel plate, ten raised buttons, box-strip digit glyphs and a cylinder confirmation button. Its editable three-digit display is also exposed in the HUD.</w:t>
+      </w:r>
+    </w:p>
+    <w:p>
+      <w:r>
+        <w:t>The rescue gate combines nine thin cylinders and a box rail. Its parent joint raises after two low switches and becomes hidden after the high switch. Each switch has a box backplate and a cylinder lever rotating from 20 to -45 degrees. Jessie's support platform is a solid 2.0 by 1.3 by 1.6 box; dismounting uses the existing eased rig transition. Buzz's holding area reuses the rear room floor, two box partitions and a cyan translucent barrier. Its red box release switch removes the barrier from drawing and contact tests. The entrance note is a thin paper box, accompanied by the arrival objective explaining that the toys need help.</w:t>
+      </w:r>
+    </w:p>
+    <w:p>
+      <w:r>
+        <w:t>The front-door padlock belongs to the existing hinge: one metal body box, two upright cylinders and a rotated cylinder crown move with the door. Laser impact hides this assembly and activates six wood-textured box fragments. Gravity, contact separation and angular impulses use the existing fixed-step solver. The eighteen rendered stair treads each rise 0.25 units; the support function matches each tread rather than letting a character sink through a ramp. Grounded actors remain on the correct floor, while Buzz retains vertical flight. Final rest-pose restoration preserves each root transform so the ending cannot move the cast back indoors.</w:t>
+      </w:r>
+    </w:p>
+    <w:p>
+      <w:r>
+        <w:t>Rehearse the entire escape without skipping its physical interactions:</w:t>
+      </w:r>
+    </w:p>
+    <w:p>
+      <w:r>
+        <w:t>.\bin\Release\HauntedToyRoom.exe --no-intro --story --gameplay-demo --no-raytrace</w:t>
       </w:r>
     </w:p>
     <w:p>

</xml_diff>

<commit_message>
Story layer polish, showcase media and documentation for the new story
Followers turn their formation to Penny's side or front when the space
behind her is another room, instead of stacking on her. New report section
on the toy chest, Buzz's bedroom and wardrobe; story figures, slides, video
clips, study guide and docs rewritten for the eight-stage story. Report
stays at 39 pages.
</commit_message>
<xml_diff>
--- a/docs/showcase/Demonstration-Study-Guide.docx
+++ b/docs/showcase/Demonstration-Study-Guide.docx
@@ -30,7 +30,7 @@
     </w:p>
     <w:p>
       <w:r>
-        <w:t>Run bin/Release/HauntedToyRoom.exe from the project folder. The arrival starts automatically. Use Y to reach the hallway puzzle quickly, Shift+N for a full replay, and G to hide the interface. Press H for help. Keep the report PDF, slide deck and Project-Demo.mp4 together for the showcase.</w:t>
+        <w:t>Run bin/Release/HauntedToyRoom.exe from the project folder. The story opens with a crane shot over the street; Y skips it. You then control Penny in the garden. Shift+N replays the story and G hides the interface. Press H for help. Keep the report PDF, slide deck and Project-Demo.mp4 together for the showcase.</w:t>
       </w:r>
     </w:p>
     <w:p>
@@ -85,7 +85,7 @@
           </w:tcPr>
           <w:p>
             <w:r>
-              <w:t>0:00–0:10</w:t>
+              <w:t>0:00–0:08</w:t>
             </w:r>
           </w:p>
         </w:tc>
@@ -95,7 +95,7 @@
           </w:tcPr>
           <w:p>
             <w:r>
-              <w:t>The haunted house: Penny enters at night through hinged doors and the connected staircase.</w:t>
+              <w:t>Night outside the house: Penny arrives at the abandoned house. The camera cranes down from the street.</w:t>
             </w:r>
           </w:p>
         </w:tc>
@@ -107,7 +107,7 @@
           </w:tcPr>
           <w:p>
             <w:r>
-              <w:t>0:10–0:20</w:t>
+              <w:t>0:08–0:18</w:t>
             </w:r>
           </w:p>
         </w:tc>
@@ -117,7 +117,7 @@
           </w:tcPr>
           <w:p>
             <w:r>
-              <w:t>A furnished world: Five indexed primitive families form furniture and articulated toys.</w:t>
+              <w:t>In through the open door: Penny walks in; the main door closes and locks. She climbs the eighteen-step stair.</w:t>
             </w:r>
           </w:p>
         </w:tc>
@@ -129,7 +129,7 @@
           </w:tcPr>
           <w:p>
             <w:r>
-              <w:t>0:20–0:30</w:t>
+              <w:t>0:18–0:26</w:t>
             </w:r>
           </w:p>
         </w:tc>
@@ -139,7 +139,7 @@
           </w:tcPr>
           <w:p>
             <w:r>
-              <w:t>Inspect the three clues: Train 2, clock 5, blocks 7. The code opens the real toy-room doors.</w:t>
+              <w:t>Three clues: 257: Train 2, clock 5, blocks 7. The keypad opens the real Toy Room doors.</w:t>
             </w:r>
           </w:p>
         </w:tc>
@@ -151,7 +151,7 @@
           </w:tcPr>
           <w:p>
             <w:r>
-              <w:t>0:30–0:42</w:t>
+              <w:t>0:26–0:36</w:t>
             </w:r>
           </w:p>
         </w:tc>
@@ -161,7 +161,7 @@
           </w:tcPr>
           <w:p>
             <w:r>
-              <w:t>Rescue through hierarchy: Penny activates two switches. Jessie rides Bullseye and dismounts onto the high platform.</w:t>
+              <w:t>The toy chest: The red wind-up button opens the lid. Woody, Jessie and Bullseye climb out alive.</w:t>
             </w:r>
           </w:p>
         </w:tc>
@@ -173,7 +173,7 @@
           </w:tcPr>
           <w:p>
             <w:r>
-              <w:t>0:42–0:52</w:t>
+              <w:t>0:36–0:46</w:t>
             </w:r>
           </w:p>
         </w:tc>
@@ -183,7 +183,7 @@
           </w:tcPr>
           <w:p>
             <w:r>
-              <w:t>Buzz and the pursuit: The release removes a translucent barrier. The ghost follows Penny to the stairs.</w:t>
+              <w:t>Downstairs together: The toys follow Penny through a graph of doorway nodes and down the stairs.</w:t>
             </w:r>
           </w:p>
         </w:tc>
@@ -195,7 +195,7 @@
           </w:tcPr>
           <w:p>
             <w:r>
-              <w:t>0:52–1:02</w:t>
+              <w:t>0:46–0:58</w:t>
             </w:r>
           </w:p>
         </w:tc>
@@ -205,7 +205,7 @@
           </w:tcPr>
           <w:p>
             <w:r>
-              <w:t>Live character takeover: Woody follows your input while the others continue. Zero releases ownership; N enters full manual mode.</w:t>
+              <w:t>Cupboard rescue: Jessie mounts Bullseye, he jumps, she opens the wardrobe and Buzz flies out.</w:t>
             </w:r>
           </w:p>
         </w:tc>
@@ -217,7 +217,7 @@
           </w:tcPr>
           <w:p>
             <w:r>
-              <w:t>1:02–1:10</w:t>
+              <w:t>0:58–1:10</w:t>
             </w:r>
           </w:p>
         </w:tc>
@@ -227,7 +227,7 @@
           </w:tcPr>
           <w:p>
             <w:r>
-              <w:t>Directional, point and spot: Moonlight is directional; the lamp adds a point source and soft spotlight.</w:t>
+              <w:t>The locked main door: Penny tries the door. Buzz flies into position; L fires a nearest-hit laser and the door breaks.</w:t>
             </w:r>
           </w:p>
         </w:tc>
@@ -239,7 +239,73 @@
           </w:tcPr>
           <w:p>
             <w:r>
-              <w:t>1:10–1:16</w:t>
+              <w:t>1:10–1:22</w:t>
+            </w:r>
+          </w:p>
+        </w:tc>
+        <w:tc>
+          <w:tcPr>
+            <w:tcW w:type="dxa" w:w="4320"/>
+          </w:tcPr>
+          <w:p>
+            <w:r>
+              <w:t>Morning escape: Everyone leaves the house. The fog thins, the sun rises and the camera pulls back.</w:t>
+            </w:r>
+          </w:p>
+        </w:tc>
+      </w:tr>
+      <w:tr>
+        <w:tc>
+          <w:tcPr>
+            <w:tcW w:type="dxa" w:w="4320"/>
+          </w:tcPr>
+          <w:p>
+            <w:r>
+              <w:t>1:22–1:30</w:t>
+            </w:r>
+          </w:p>
+        </w:tc>
+        <w:tc>
+          <w:tcPr>
+            <w:tcW w:type="dxa" w:w="4320"/>
+          </w:tcPr>
+          <w:p>
+            <w:r>
+              <w:t>Free exploration: The story stays open in daylight. Adiba Tahsin / 2107031 / CSE-4102.</w:t>
+            </w:r>
+          </w:p>
+        </w:tc>
+      </w:tr>
+      <w:tr>
+        <w:tc>
+          <w:tcPr>
+            <w:tcW w:type="dxa" w:w="4320"/>
+          </w:tcPr>
+          <w:p>
+            <w:r>
+              <w:t>1:30–1:38</w:t>
+            </w:r>
+          </w:p>
+        </w:tc>
+        <w:tc>
+          <w:tcPr>
+            <w:tcW w:type="dxa" w:w="4320"/>
+          </w:tcPr>
+          <w:p>
+            <w:r>
+              <w:t>Live character takeover: Woody follows your input while the others keep accompanying Penny. Zero releases ownership.</w:t>
+            </w:r>
+          </w:p>
+        </w:tc>
+      </w:tr>
+      <w:tr>
+        <w:tc>
+          <w:tcPr>
+            <w:tcW w:type="dxa" w:w="4320"/>
+          </w:tcPr>
+          <w:p>
+            <w:r>
+              <w:t>1:38–1:44</w:t>
             </w:r>
           </w:p>
         </w:tc>
@@ -261,7 +327,7 @@
           </w:tcPr>
           <w:p>
             <w:r>
-              <w:t>1:16–1:22</w:t>
+              <w:t>1:44–1:50</w:t>
             </w:r>
           </w:p>
         </w:tc>
@@ -283,29 +349,7 @@
           </w:tcPr>
           <w:p>
             <w:r>
-              <w:t>1:22–1:30</w:t>
-            </w:r>
-          </w:p>
-        </w:tc>
-        <w:tc>
-          <w:tcPr>
-            <w:tcW w:type="dxa" w:w="4320"/>
-          </w:tcPr>
-          <w:p>
-            <w:r>
-              <w:t>Texture coordinates: UVs map wood, wallpaper, fabric and lunar craters onto shared geometry.</w:t>
-            </w:r>
-          </w:p>
-        </w:tc>
-      </w:tr>
-      <w:tr>
-        <w:tc>
-          <w:tcPr>
-            <w:tcW w:type="dxa" w:w="4320"/>
-          </w:tcPr>
-          <w:p>
-            <w:r>
-              <w:t>1:30–1:40</w:t>
+              <w:t>1:50–2:00</w:t>
             </w:r>
           </w:p>
         </w:tc>
@@ -316,50 +360,6 @@
           <w:p>
             <w:r>
               <w:t>Analytic ray tracing: A BVH accelerates exact primitive hits, shadows, mirror paths and straight transparency.</w:t>
-            </w:r>
-          </w:p>
-        </w:tc>
-      </w:tr>
-      <w:tr>
-        <w:tc>
-          <w:tcPr>
-            <w:tcW w:type="dxa" w:w="4320"/>
-          </w:tcPr>
-          <w:p>
-            <w:r>
-              <w:t>1:40–1:52</w:t>
-            </w:r>
-          </w:p>
-        </w:tc>
-        <w:tc>
-          <w:tcPr>
-            <w:tcW w:type="dxa" w:w="4320"/>
-          </w:tcPr>
-          <w:p>
-            <w:r>
-              <w:t>The entrance breaks: Buzz flies and aims. Only a nearest-hit laser impact releases six physical wood fragments.</w:t>
-            </w:r>
-          </w:p>
-        </w:tc>
-      </w:tr>
-      <w:tr>
-        <w:tc>
-          <w:tcPr>
-            <w:tcW w:type="dxa" w:w="4320"/>
-          </w:tcPr>
-          <w:p>
-            <w:r>
-              <w:t>1:52–2:00</w:t>
-            </w:r>
-          </w:p>
-        </w:tc>
-        <w:tc>
-          <w:tcPr>
-            <w:tcW w:type="dxa" w:w="4320"/>
-          </w:tcPr>
-          <w:p>
-            <w:r>
-              <w:t>The toys are safe: Every character is physically outside. The cast idles in the garden. Adiba Tahsin / 2107031 / CSE-4102.</w:t>
             </w:r>
           </w:p>
         </w:tc>
@@ -375,42 +375,52 @@
     </w:p>
     <w:p>
       <w:r>
-        <w:t>1. Y skips arrival. Inspect all three hallway clues with Enter, then approach the keypad. Enter 257 and confirm with Enter. A wrong code clears the digits and keeps the door locked.</w:t>
+        <w:t>1. Y skips the opening shot. Walk Penny (W/S/A/D) through the gate, up the porch and in at the open front door: it closes and locks behind her. Climb the stairs.</w:t>
       </w:r>
     </w:p>
     <w:p>
       <w:r>
-        <w:t>2. Penny activates the two red low switches with Enter. Select Jessie with 2, approach Bullseye and press R. Ride beneath the high platform, R dismounts onto it, and Enter activates the third switch.</w:t>
+        <w:t>2. Inspect the train, clock and blocks with Enter, then use the keypad: 257 and Enter. A wrong code clears the digits and keeps the door locked.</w:t>
       </w:r>
     </w:p>
     <w:p>
       <w:r>
-        <w:t>3. Ctrl+0 selects Penny. Activate the red release near the rear translucent barrier. Return through the hallway, descend the stairs and press Enter at the sealed front door. Explain Buzz flight, actual nearest-hit laser impact and the six physical fragments.</w:t>
+        <w:t>3. Walk to the toy chest and press Enter at its glowing red button. The lid opens; Woody, Jessie and Bullseye climb out. They follow Penny from now on.</w:t>
       </w:r>
     </w:p>
     <w:p>
       <w:r>
-        <w:t>4. 5 selects the car. W/S and A/D drive, L toggles moving spotlights. F focuses it; hallway camera access is supported.</w:t>
+        <w:t>4. Go downstairs. Press Enter at the door on the left of the corridor. In Buzz's room press Enter at the wardrobe: the knob is too high, so Jessie rides Bullseye, he jumps and she opens it. Buzz flies out. (Or select Jessie with 2, R to mount, ride beside the wardrobe and L to jump.)</w:t>
       </w:r>
     </w:p>
     <w:p>
       <w:r>
-        <w:t>5. 7 selects the lamp. R toggles power, W/S tilts, A/D swivels, comma/period alters intensity. Both light position and direction follow the rig.</w:t>
+        <w:t>5. Lead everyone to the main entrance and press Enter: it is locked. Buzz flies into position; press L to fire. Walk outside: the night turns into morning and the camera pulls back. Free exploration follows.</w:t>
       </w:r>
     </w:p>
     <w:p>
       <w:r>
-        <w:t>6. F2 cycles Flat/Gouraud/Phong/Blinn and selects the raster path. F5/F6/F7 isolate terms. F3 toggles colour textures. F4 selects analytic ray tracing; 9 changes bounces and minus/equal changes resolution.</w:t>
+        <w:t>6. 5 selects the car. W/S and A/D drive, L toggles moving spotlights. F focuses it; hallway camera access is supported.</w:t>
       </w:r>
     </w:p>
     <w:p>
       <w:r>
-        <w:t>7. Click a toy or furniture. Tab enters edit mode; T chooses Translate/Rotate/Scale/Shear. J/L, U/O and I/K change axes. M mirrors, Backspace restores. V lists actual parts; Shift+V prints vertices/indices.</w:t>
+        <w:t>7. 7 selects the lamp. R toggles power, W/S tilts, A/D swivels, comma/period alters intensity. Both light position and direction follow the rig.</w:t>
       </w:r>
     </w:p>
     <w:p>
       <w:r>
-        <w:t>8. O enables haunted ambience. Show the ghost's opacity, ball rolling and lamp motion. N resumes the coordinated story; Shift+N restarts it.</w:t>
+        <w:t>8. F2 cycles Flat/Gouraud/Phong/Blinn and selects the raster path. F5/F6/F7 isolate terms. F3 toggles colour textures. F4 selects analytic ray tracing; 9 changes bounces and minus/equal changes resolution.</w:t>
+      </w:r>
+    </w:p>
+    <w:p>
+      <w:r>
+        <w:t>9. Click a toy or furniture. Tab enters edit mode; T chooses Translate/Rotate/Scale/Shear. J/L, U/O and I/K change axes. M mirrors, Backspace restores. V lists actual parts; Shift+V prints vertices/indices.</w:t>
+      </w:r>
+    </w:p>
+    <w:p>
+      <w:r>
+        <w:t>10. O enables haunted ambience. Show the ghost's opacity, ball rolling and lamp motion. N toggles full manual mode; Shift+N restarts the story.</w:t>
       </w:r>
     </w:p>
     <w:p>
@@ -430,7 +440,7 @@
     </w:p>
     <w:p>
       <w:r>
-        <w:t>.\bin\Release\HauntedToyRoom.exe --no-intro --manual --no-raytrace --shading 1 --select 3 --cam 0,1.5,-4.5,0,1.15,-6.6</w:t>
+        <w:t>.\bin\Release\HauntedToyRoom.exe --no-intro --manual --no-raytrace --shading 1 --select 3 --cam -2.0,1.5,2.4,-3.4,1.15,0.4</w:t>
       </w:r>
     </w:p>
     <w:p>
@@ -443,7 +453,7 @@
     </w:p>
     <w:p>
       <w:r>
-        <w:t>Selection during playback owns only one actor. StoryDirector skips writes to that actor and advances a separate virtual route cursor for scene gates. Other actors continue normal waypoint motion and animation. They ignore the owned actor as an obstacle, so parking across a path cannot stall their choreography; wall and furniture contacts remain active for your actor. The door always requires a real laser hit, including when Buzz is manually controlled. The ending requires every actual character outside. Releasing control rejoins a waypoint on the current floor without teleporting. A mounted pair is detached when selected for independent control; remounting intentionally drives the connected pair. 0 releases ownership; N retains the separate full manual mode. Penny is controllable after arrival by clicking her or using Ctrl+0. The arrival camera remains cinematic until Y or arrival completion.</w:t>
+        <w:t>The player layer owns one character; the story layer drives the rest. Freed toys accompany Penny in fixed formation slots and route between floors through thirteen doorway nodes (Floyd-Warshall next steps). Taking one toy over removes it from the group without moving the others. Jessie and Bullseye perform the wardrobe rescue on their own unless you control one of them; then you do it with R, riding and L. Buzz flies into position at the locked door and waits for your L. The door always requires a real laser hit, including when Buzz is manually controlled. Toys still inside the chest or wardrobe cannot be selected. A mounted pair is detached when selected for independent control; remounting drives the connected pair. 0 releases ownership; N switches to full manual mode; Shift+N replays the story.</w:t>
       </w:r>
     </w:p>
     <w:p>
@@ -459,32 +469,32 @@
         <w:pStyle w:val="Heading1"/>
       </w:pPr>
       <w:r>
-        <w:t>Escape implementation and objects</w:t>
+        <w:t>Story implementation and objects</w:t>
       </w:r>
     </w:p>
     <w:p>
       <w:r>
-        <w:t>The keypad requires all three inspected clues and the code 257. A wrong code shows Incorrect Code and clears only the digits. Penny must approach both low switches. Jessie must have ridden Bullseye beneath the high switch, dismounted onto its platform and completed her transition before Enter activates it. The rear release belongs to Penny. At the ground-floor entrance, Enter starts Buzz's flight. The door breaks only after his nearest laser hit is the actual door for more than 0.65 seconds. Six preallocated boards receive impulses; the ghost pursues at 1.6 units per second. The ending requires the broken entrance and Penny plus all four rescued toys physically outside.</w:t>
+        <w:t>Every stage advances only on its real condition. Penny must actually walk through the open front door before it locks. The keypad requires all three inspected clues and 257; a wrong code shows Incorrect Code and clears only the digits. The chest opens when Enter is pressed within 3.2 units of it. Buzz's door opens with Enter beside it on the ground floor. The wardrobe opens only when a mounted Bullseye is within 1.4 units of the spot beside it and his jump lift exceeds 0.45: Penny's Enter there asks Jessie and Bullseye for help, or the player can mount (R), ride and jump (L) themselves. The main door must be tried (Enter, or standing at it for one second). It breaks only after Buzz's nearest laser hit has been the real door leaf for more than 0.65 seconds. Morning starts when Penny steps outside; free exploration follows once the sixteen-second sunrise has finished and the camera has pulled back over the house.</w:t>
       </w:r>
     </w:p>
     <w:p>
       <w:r>
-        <w:t>The wooden train uses box chassis and cab pieces, a horizontal cylindrical boiler, chimney and cylinder wheels. Two separate cars and a raised seven-segment 2 identify its clue. Seven coloured cubes form the block clue's 7. The hallway clock has a circular cylinder case and a thin cylinder face. The provided BMP uses planar cap UVs; a negative v repeat corrects printed orientation after rotation. A raised 5 below the face keeps the clue readable. The combination keypad has a solid wood housing, steel plate, ten raised buttons, box-strip digit glyphs and a cylinder confirmation button. Its editable three-digit display is also exposed in the HUD.</w:t>
+        <w:t>The wooden train uses box chassis and cab pieces, a horizontal cylindrical boiler, chimney and cylinder wheels. Two separate cars and a raised seven-segment 2 identify its clue. Seven coloured cubes form the block clue's 7. The hallway clock is wall-sized: a 0.8-unit circular cylinder case hung at eye height and a thin cylinder face. The provided BMP uses planar cap UVs; a negative v repeat corrects printed orientation after rotation. A small brass plate below the face carries a raised 5. The combination keypad has a solid wood housing, steel plate, ten raised buttons, box-strip digit glyphs and a cylinder confirmation button. Its editable three-digit display is also exposed in the HUD.</w:t>
       </w:r>
     </w:p>
     <w:p>
       <w:r>
-        <w:t>The rescue gate combines nine thin cylinders and a box rail. Its parent joint raises after two low switches and becomes hidden after the high switch. Each switch has a box backplate and a cylinder lever rotating from 20 to -45 degrees. Jessie's support platform is a solid 2.0 by 1.3 by 1.6 box; dismounting uses the existing eased rig transition. Buzz's holding area reuses the rear room floor, two box partitions and a cyan translucent barrier. Its red box release switch removes the barrier from drawing and contact tests. The entrance note is a thin paper box, accompanied by the arrival objective explaining that the toys need help.</w:t>
+        <w:t>The toy chest is hollow (floor board and four solid walls) with iron brackets and bands, brass rivets, a keyhole plate and a front panel carrying a procedural painted texture: worn red planks, stars, clouds and a rocket. Its lid is a hinge joint holding a deep frame box and a cylinder dome whose lower half lies inside the frame, so the lid stays curved when open. The red wind-up button pulses and a red story light follows it. Pressing it swings the lid to -105 degrees; Woody, Jessie and Bullseye climb to the rim and hop out with the eased transition (a 0.4 sin(pi t) arc), then cheer. Buzz's bedroom under the Toy Room is ordinary: star wallpaper, a patchwork star quilt, a bookcase with a globe, rocket and teddy bear, a nightstand lamp (the room's light), a star rug and a football. The wardrobe has a hollow carcass, an arched crown with finials and two hinged doors with arched panels, cut-out gold stars and knobs 2.65 units up, too high for Penny; a green glow leaks from the gap while Buzz is inside.</w:t>
       </w:r>
     </w:p>
     <w:p>
       <w:r>
-        <w:t>The front-door padlock belongs to the existing hinge: one metal body box, two upright cylinders and a rotated cylinder crown move with the door. Laser impact hides this assembly and activates six wood-textured box fragments. Gravity, contact separation and angular impulses use the existing fixed-step solver. The eighteen rendered stair treads each rise 0.25 units; the support function matches each tread rather than letting a character sink through a ramp. Grounded actors remain on the correct floor, while Buzz retains vertical flight. Final rest-pose restoration preserves each root transform so the ending cannot move the cast back indoors.</w:t>
+        <w:t>Bullseye's jump lifts his body joint, and so the saddle and a mounted Jessie, by 0.75 sin(pi t) over 0.9 s while his root stays on the floor; Jessie's reach pose raises her right arm. Buzz then flies out on four waypoints. At the entrance the padlock rides on the door hinge; the laser hides the door and releases six wood boards that the fixed-step solver drops onto the porch deck.</w:t>
       </w:r>
     </w:p>
     <w:p>
       <w:r>
-        <w:t>Rehearse the entire escape without skipping its physical interactions:</w:t>
+        <w:t>Rehearse the entire story without skipping its physical interactions:</w:t>
       </w:r>
     </w:p>
     <w:p>
@@ -594,6 +604,58 @@
     <w:p>
       <w:r>
         <w:t>Her root is attached under the saddle. The horse world matrix multiplies the saddle and rider local matrices, so translation, rotation and gait propagate naturally.</w:t>
+      </w:r>
+    </w:p>
+    <w:p>
+      <w:pPr>
+        <w:pStyle w:val="Heading2"/>
+      </w:pPr>
+      <w:r>
+        <w:t>How does Bullseye's jump lift Jessie to the wardrobe knob?</w:t>
+      </w:r>
+    </w:p>
+    <w:p>
+      <w:r>
+        <w:t>The jump offsets his body joint by 0.75 sin(pi t) over 0.9 s. The saddle and Jessie are descendants of that joint, so they rise with it; his root stays on the floor for physics.</w:t>
+      </w:r>
+    </w:p>
+    <w:p>
+      <w:pPr>
+        <w:pStyle w:val="Heading2"/>
+      </w:pPr>
+      <w:r>
+        <w:t>How do the toys follow Penny between floors?</w:t>
+      </w:r>
+    </w:p>
+    <w:p>
+      <w:r>
+        <w:t>Each part of the house is a zone joined by doorway nodes. In Penny's zone a toy walks to its formation slot; elsewhere it walks to the next node on the Floyd-Warshall shortest route toward her.</w:t>
+      </w:r>
+    </w:p>
+    <w:p>
+      <w:pPr>
+        <w:pStyle w:val="Heading2"/>
+      </w:pPr>
+      <w:r>
+        <w:t>How does the chest lid stay curved when open?</w:t>
+      </w:r>
+    </w:p>
+    <w:p>
+      <w:r>
+        <w:t>The lid is a hinge joint holding a deep frame box and a half-visible cylinder dome. The dome's lower half lies inside the frame, so only the curved top is ever visible.</w:t>
+      </w:r>
+    </w:p>
+    <w:p>
+      <w:pPr>
+        <w:pStyle w:val="Heading2"/>
+      </w:pPr>
+      <w:r>
+        <w:t>What makes the morning?</w:t>
+      </w:r>
+    </w:p>
+    <w:p>
+      <w:r>
+        <w:t>The story drives the clock from 23:36 to 07:00 in sixteen seconds. The same hour moves the sun, blends sky and ambient colours and scales the fog density by the night factor.</w:t>
       </w:r>
     </w:p>
     <w:p>

</xml_diff>

<commit_message>
feat: Add outdoor sky and solid characters to the showcase
</commit_message>
<xml_diff>
--- a/docs/showcase/Demonstration-Study-Guide.docx
+++ b/docs/showcase/Demonstration-Study-Guide.docx
@@ -410,7 +410,7 @@
     </w:p>
     <w:p>
       <w:r>
-        <w:t>8. F2 cycles Flat/Gouraud/Phong/Blinn and selects the raster path. F5/F6/F7 isolate terms. F3 toggles colour textures. F4 selects analytic ray tracing; 9 changes bounces and minus/equal changes resolution.</w:t>
+        <w:t>8. F2 cycles Flat/Gouraud/Phong/Blinn and selects the raster path. F5/F6/F7 isolate terms. F3 toggles colour textures. F4 selects analytic ray tracing; Ctrl+9 changes bounces and minus/equal changes resolution. Walk outside to compare the sky dome, sun/moon light and shadows in both paths.</w:t>
       </w:r>
     </w:p>
     <w:p>
@@ -421,6 +421,11 @@
     <w:p>
       <w:r>
         <w:t>10. O enables haunted ambience. Show the ghost's opacity, ball rolling and lamp motion. N toggles full manual mode; Shift+N restarts the story.</w:t>
+      </w:r>
+    </w:p>
+    <w:p>
+      <w:r>
+        <w:t>11. Select a toy, then press 9 (or click the PENNY row): Penny is yours again wherever she is, with the follow camera behind her. Walk her up the stairs to show the smoothed camera, and into the toys to show solid contact.</w:t>
       </w:r>
     </w:p>
     <w:p>
@@ -453,7 +458,7 @@
     </w:p>
     <w:p>
       <w:r>
-        <w:t>The player layer owns one character; the story layer drives the rest. Freed toys accompany Penny in fixed formation slots and route between floors through thirteen doorway nodes (Floyd-Warshall next steps). Taking one toy over removes it from the group without moving the others. Jessie and Bullseye perform the wardrobe rescue on their own unless you control one of them; then you do it with R, riding and L. Buzz flies into position at the locked door and waits for your L. The door always requires a real laser hit, including when Buzz is manually controlled. Toys still inside the chest or wardrobe cannot be selected. A mounted pair is detached when selected for independent control; remounting drives the connected pair. 0 releases ownership; N switches to full manual mode; Shift+N replays the story.</w:t>
+        <w:t>The player layer owns one character; the story layer drives the rest. Freed toys accompany Penny in fixed formation slots and route between floors through thirteen doorway nodes (Floyd-Warshall next steps). Taking one toy over removes it from the group without moving the others. Characters are solid: overlaps resolve by priority (driven character, story task, Penny, followers) and story walkers steer around bodies ahead. 9 or the PENNY row takes Penny back at any time. Jessie and Bullseye perform the wardrobe rescue on their own unless you control one of them; then you do it with R, riding and L. Buzz flies into position at the locked door and waits for your L. The door always requires a real laser hit, including when Buzz is manually controlled. Toys still inside the chest or wardrobe cannot be selected. A mounted pair is detached when selected for independent control; remounting drives the connected pair. 0 releases ownership; N switches to full manual mode; Shift+N replays the story.</w:t>
       </w:r>
     </w:p>
     <w:p>
@@ -767,12 +772,51 @@
         <w:pStyle w:val="Heading2"/>
       </w:pPr>
       <w:r>
+        <w:t>Why does the ray tracer show the same sky as the rasteriser?</w:t>
+      </w:r>
+    </w:p>
+    <w:p>
+      <w:r>
+        <w:t>Both include sky.glsl. The raster pass shades every pixel still at the far plane with skyRadiance(view direction); the tracer returns skyRadiance(ray direction) whenever a ray hits nothing, including reflected and transmitted rays.</w:t>
+      </w:r>
+    </w:p>
+    <w:p>
+      <w:pPr>
+        <w:pStyle w:val="Heading2"/>
+      </w:pPr>
+      <w:r>
+        <w:t>Why do Penny and Bullseye use several collision boxes?</w:t>
+      </w:r>
+    </w:p>
+    <w:p>
+      <w:r>
+        <w:t>An axis-aligned box around a long body swells by up to 41 percent at 45 degrees and could not turn in the corridor. A spine of square boxes stays compact at any heading yet covers nose to tail, so the head stops at walls.</w:t>
+      </w:r>
+    </w:p>
+    <w:p>
+      <w:pPr>
+        <w:pStyle w:val="Heading2"/>
+      </w:pPr>
+      <w:r>
+        <w:t>How do the characters avoid jamming in doorways?</w:t>
+      </w:r>
+    </w:p>
+    <w:p>
+      <w:r>
+        <w:t>Overlaps are resolved by strict priority: the lower body yields the whole push, or steps aside along the other axis when a wall pins it, and story walkers steer around bodies ahead. Equal shares would cancel and jam.</w:t>
+      </w:r>
+    </w:p>
+    <w:p>
+      <w:pPr>
+        <w:pStyle w:val="Heading2"/>
+      </w:pPr>
+      <w:r>
         <w:t>What are the deliberate limitations?</w:t>
       </w:r>
     </w:p>
     <w:p>
       <w:r>
-        <w:t>Lamp-only general raster shadow map; selected/thresholded ray shadows; finite continuations; straight transparency; box-approximate contacts. No global diffuse transport or physical refraction.</w:t>
+        <w:t>Raster shadow maps only for the lamp and, outdoors, the sun/moon; selected/thresholded ray shadows; finite continuations; straight transparency; box-approximate contacts. No global diffuse transport or physical refraction.</w:t>
       </w:r>
     </w:p>
     <w:p>
@@ -971,7 +1015,7 @@
           </w:tcPr>
           <w:p>
             <w:r>
-              <w:t>`RenderSettings.h`; keys 9 and minus/equal</w:t>
+              <w:t>`RenderSettings.h`; keys Ctrl+9 and minus/equal</w:t>
             </w:r>
           </w:p>
         </w:tc>

</xml_diff>